<commit_message>
refactor: changed words for memescript
</commit_message>
<xml_diff>
--- a/docs/relatorio_tecnico.docx
+++ b/docs/relatorio_tecnico.docx
@@ -237,7 +237,7 @@
               <w:rPr>
                 <w:sz w:val="17"/>
               </w:rPr>
-              <w:t>ACORDA_PEDRINHO</w:t>
+              <w:t>E_HORA_DO_SHOW</w:t>
             </w:r>
           </w:p>
         </w:tc>
@@ -290,7 +290,7 @@
               <w:rPr>
                 <w:sz w:val="17"/>
               </w:rPr>
-              <w:t>ACABOU</w:t>
+              <w:t>JA_ACABOU_JESSICA</w:t>
             </w:r>
           </w:p>
         </w:tc>
@@ -661,7 +661,7 @@
               <w:rPr>
                 <w:sz w:val="17"/>
               </w:rPr>
-              <w:t>E_VERDADE_ESSE_BILETE</w:t>
+              <w:t>PODE_ISSO_ARNALDO</w:t>
             </w:r>
           </w:p>
         </w:tc>
@@ -714,7 +714,7 @@
               <w:rPr>
                 <w:sz w:val="17"/>
               </w:rPr>
-              <w:t>SO_QUE_NAO</w:t>
+              <w:t>ERROU</w:t>
             </w:r>
           </w:p>
         </w:tc>
@@ -2277,7 +2277,7 @@
               <w:rPr>
                 <w:sz w:val="17"/>
               </w:rPr>
-              <w:t>ACORDA_PEDRINHO até ATA</w:t>
+              <w:t>E_HORA_DO_SHOW até ATA</w:t>
             </w:r>
           </w:p>
         </w:tc>
@@ -3511,7 +3511,7 @@
         <w:pStyle w:val="Code"/>
       </w:pPr>
       <w:r>
-        <w:t>T = { ACORDA_PEDRINHO, ACABOU, SABOR_INTEIRO,</w:t>
+        <w:t>T = { E_HORA_DO_SHOW, JA_ACABOU_JESSICA, SABOR_INTEIRO,</w:t>
       </w:r>
     </w:p>
     <w:p>
@@ -3527,7 +3527,7 @@
         <w:pStyle w:val="Code"/>
       </w:pPr>
       <w:r>
-        <w:t xml:space="preserve">      AMOSTRADINHO, E_VERDADE_ESSE_BILETE,</w:t>
+        <w:t xml:space="preserve">      AMOSTRADINHO, PODE_ISSO_ARNALDO,</w:t>
       </w:r>
     </w:p>
     <w:p>
@@ -3535,7 +3535,7 @@
         <w:pStyle w:val="Code"/>
       </w:pPr>
       <w:r>
-        <w:t xml:space="preserve">      SO_QUE_NAO, BORA_BILL, DESCANSAR_NE, ATA,</w:t>
+        <w:t xml:space="preserve">      ERROU, BORA_BILL, DESCANSAR_NE, ATA,</w:t>
       </w:r>
     </w:p>
     <w:p>
@@ -3592,7 +3592,7 @@
     </w:p>
     <w:p>
       <w:r>
-        <w:t>Os blocos têm fechamento explícito. O primeiro ATA disponível fecha a construção aberta mais interna. Em um if, SO_QUE_NAO pertence ao mesmo if, e um único ATA fecha seus dois ramos. Essa estrutura elimina a associação ambígua de else.</w:t>
+        <w:t>Os blocos têm fechamento explícito. O primeiro ATA disponível fecha a construção aberta mais interna. Em um if, ERROU pertence ao mesmo if, e um único ATA fecha seus dois ramos. Essa estrutura elimina a associação ambígua de else.</w:t>
       </w:r>
     </w:p>
     <w:p>
@@ -3613,7 +3613,7 @@
         <w:pStyle w:val="Code"/>
       </w:pPr>
       <w:r>
-        <w:t>program = "ACORDA_PEDRINHO", { declaration },</w:t>
+        <w:t>program = "E_HORA_DO_SHOW", { declaration },</w:t>
       </w:r>
     </w:p>
     <w:p>
@@ -3621,7 +3621,7 @@
         <w:pStyle w:val="Code"/>
       </w:pPr>
       <w:r>
-        <w:t xml:space="preserve">          { statement }, "ACABOU" ;</w:t>
+        <w:t xml:space="preserve">          { statement }, "JA_ACABOU_JESSICA" ;</w:t>
       </w:r>
     </w:p>
     <w:p>
@@ -3711,7 +3711,7 @@
         <w:pStyle w:val="Code"/>
       </w:pPr>
       <w:r>
-        <w:t>if_stmt = "E_VERDADE_ESSE_BILETE", "(", expression, ")",</w:t>
+        <w:t>if_stmt = "PODE_ISSO_ARNALDO", "(", expression, ")",</w:t>
       </w:r>
     </w:p>
     <w:p>
@@ -3719,7 +3719,7 @@
         <w:pStyle w:val="Code"/>
       </w:pPr>
       <w:r>
-        <w:t xml:space="preserve">          block, [ "SO_QUE_NAO", block ], "ATA" ;</w:t>
+        <w:t xml:space="preserve">          block, [ "ERROU", block ], "ATA" ;</w:t>
       </w:r>
     </w:p>
     <w:p>
@@ -5537,7 +5537,7 @@
         <w:pStyle w:val="Code"/>
       </w:pPr>
       <w:r>
-        <w:t>ACORDA_PEDRINHO</w:t>
+        <w:t>E_HORA_DO_SHOW</w:t>
       </w:r>
     </w:p>
     <w:p>
@@ -5577,7 +5577,7 @@
         <w:pStyle w:val="Code"/>
       </w:pPr>
       <w:r>
-        <w:t>ACABOU</w:t>
+        <w:t>JA_ACABOU_JESSICA</w:t>
       </w:r>
     </w:p>
     <w:p>
@@ -5655,7 +5655,7 @@
         <w:pStyle w:val="Code"/>
       </w:pPr>
       <w:r>
-        <w:t>ACORDA_PEDRINHO</w:t>
+        <w:t>E_HORA_DO_SHOW</w:t>
       </w:r>
     </w:p>
     <w:p>
@@ -5767,7 +5767,7 @@
         <w:pStyle w:val="Code"/>
       </w:pPr>
       <w:r>
-        <w:t xml:space="preserve">    E_VERDADE_ESSE_BILETE (energia &gt;= 67)</w:t>
+        <w:t xml:space="preserve">    PODE_ISSO_ARNALDO (energia &gt;= 67)</w:t>
       </w:r>
     </w:p>
     <w:p>
@@ -5791,7 +5791,7 @@
         <w:pStyle w:val="Code"/>
       </w:pPr>
       <w:r>
-        <w:t xml:space="preserve">    SO_QUE_NAO</w:t>
+        <w:t xml:space="preserve">    ERROU</w:t>
       </w:r>
     </w:p>
     <w:p>
@@ -5855,7 +5855,7 @@
         <w:pStyle w:val="Code"/>
       </w:pPr>
       <w:r>
-        <w:t>ACABOU</w:t>
+        <w:t>JA_ACABOU_JESSICA</w:t>
       </w:r>
     </w:p>
     <w:p>
@@ -6724,7 +6724,7 @@
         <w:t>Referências temáticas consultadas em 6 de outubro de 2026.</w:t>
       </w:r>
       <w:r>
-        <w:t xml:space="preserve"> O Museu de Memes registra É verdade esse bilete. A CNN reúne Receba, Bora Bill e Acorda Pedrinho entre os virais de 2022. A Exame descreve o bordão Sabor energético em janeiro de 2026. Os comandos técnicos e a família SABOR são adaptações próprias.</w:t>
+        <w:t xml:space="preserve"> É hora do show inspira a abertura do programa. Já acabou, Jéssica inspira o fechamento. Pode isso, Arnaldo inspira o teste de condição, e Errou, do Faustão, o ramo alternativo. A CNN reúne Receba e Bora Bill entre os virais de 2022. A Exame descreve o bordão Sabor energético. Os comandos técnicos e a família SABOR são adaptações próprias.</w:t>
       </w:r>
     </w:p>
     <w:p>
@@ -6735,7 +6735,40 @@
         <w:rPr>
           <w:sz w:val="16"/>
         </w:rPr>
-        <w:t>https://museudememes.com.br/collection/e-verdade-esse-bilete</w:t>
+        <w:t>https://33giga.com.br/e-hora-do-show-confira-memes-saidos-do-iconico-video-de-bambam-e-companhia</w:t>
+      </w:r>
+    </w:p>
+    <w:p>
+      <w:pPr>
+        <w:spacing w:after="80"/>
+      </w:pPr>
+      <w:r>
+        <w:rPr>
+          <w:sz w:val="16"/>
+        </w:rPr>
+        <w:t>https://museudememes.com.br/collection/ja-acabou-jessica</w:t>
+      </w:r>
+    </w:p>
+    <w:p>
+      <w:pPr>
+        <w:spacing w:after="80"/>
+      </w:pPr>
+      <w:r>
+        <w:rPr>
+          <w:sz w:val="16"/>
+        </w:rPr>
+        <w:t>https://redeglobo.globo.com/rj/tvriosul/Quem-Somos/noticia/pode-isso-arnaldo-novo-quadro-do-rj1-com-arnaldo-cezar-coelho.ghtml</w:t>
+      </w:r>
+    </w:p>
+    <w:p>
+      <w:pPr>
+        <w:spacing w:after="80"/>
+      </w:pPr>
+      <w:r>
+        <w:rPr>
+          <w:sz w:val="16"/>
+        </w:rPr>
+        <w:t>https://gshow.globo.com/tv/noticia/publico-se-diverte-revendo-quadro-do-domingao-que-deu-origem-ao-classico-meme-do-faustao-errou.ghtml</w:t>
       </w:r>
     </w:p>
     <w:p>
@@ -7203,7 +7236,7 @@
               <w:rPr>
                 <w:sz w:val="17"/>
               </w:rPr>
-              <w:t>apresentacao.pptx e roteiro_defesa.md</w:t>
+              <w:t>apresentacao_nova.pptx e roteiro_defesa.md</w:t>
             </w:r>
           </w:p>
         </w:tc>

</xml_diff>

<commit_message>
Ajustes finais para a entrega
- Valores lógicos exibidos como verdadeiro/falso (codegen e testes)
- Relatório: três decisões próprias reescritas com comparação à BIRL-Lite,
  justificativa do Python, alfabeto Σ, integrantes e declaração de uso de IA
- Relatório .docx e .pdf regenerados a partir das mesmas mudanças do .md
- Apresentação: integrantes no slide 1, decisões no slide 14 e notas sem
  textos de orientação da IA
- README: referências a arquivos inexistentes removidas
- Registro de validação e arquivos gerados atualizados

Co-Authored-By: Claude Opus 5.5 <noreply@anthropic.com>
Claude-Session: https://claude.ai/code/session_01PW8Rc3ZxdQvL2hx9s4LSh8
</commit_message>
<xml_diff>
--- a/docs/relatorio_tecnico.docx
+++ b/docs/relatorio_tecnico.docx
@@ -25,7 +25,7 @@
     </w:p>
     <w:p>
       <w:r>
-        <w:t>Grupo de Pedro Rockenbach Frosi • Versão 1.0 • Outubro de 2026</w:t>
+        <w:t>Integrantes: Cristian dos Santos Siqueira, Marco Antônio Hendges, Pedro Rockenbach Frosi e William Rafael Fagundes • Versão 1.0 • Outubro de 2026</w:t>
       </w:r>
     </w:p>
     <w:p>
@@ -55,6 +55,11 @@
       </w:r>
     </w:p>
     <w:p>
+      <w:r>
+        <w:t>A BIRL-Lite do enunciado serviu apenas como modelo do nível de formalização. As três decisões abaixo mudam a forma da gramática, e não só os nomes das palavras reservadas.</w:t>
+      </w:r>
+    </w:p>
+    <w:p>
       <w:pPr>
         <w:ind w:left="216"/>
       </w:pPr>
@@ -65,10 +70,10 @@
         <w:rPr>
           <w:b/>
         </w:rPr>
-        <w:t>Vocabulário temático e grafia estável.</w:t>
+        <w:t>Atribuição introduzida por palavra reservada.</w:t>
       </w:r>
       <w:r>
-        <w:t xml:space="preserve"> Palavras reservadas em maiúsculas e com sublinhados associam memes a operações: RECEBA atribui, AMOSTRADINHO exibe e DESCANSAR_NE interrompe um laço. O prefixo SABOR identifica tipos. Operadores matemáticos mantêm a grafia usual.</w:t>
+        <w:t xml:space="preserve"> Na BIRL-Lite, uma atribuição é id = expressão;. Na MemeScript, é RECEBA id = expressão;. Com isso, todo comando começa com uma palavra reservada própria (RECEBA, QUERO_CAFE, AMOSTRADINHO, PODE_ISSO_ARNALDO, BORA_BILL ou DESCANSAR_NE), e o parser escolhe a produção de statement olhando apenas o primeiro token, sem precisar fatorar a gramática. Atribuição e declaração também ficam visualmente distintas.</w:t>
       </w:r>
     </w:p>
     <w:p>
@@ -82,10 +87,10 @@
         <w:rPr>
           <w:b/>
         </w:rPr>
-        <w:t>Tipos explícitos e escopo global.</w:t>
+        <w:t>Seção de declarações separada e inicialização obrigatória.</w:t>
       </w:r>
       <w:r>
-        <w:t xml:space="preserve"> Todas as declarações aparecem no início e possuem inicializador. A linguagem usa inteiro, real e texto, com promoção de inteiro para real. Essa escolha torna a tabela de símbolos e as incompatibilidades observáveis sem exigir funções ou escopos locais.</w:t>
+        <w:t xml:space="preserve"> Na BIRL-Lite, declarações e comandos se misturam no mesmo bloco e o valor inicial é opcional. Na MemeScript, todas as declarações vêm no início do programa, antes do primeiro comando, e cada uma exige inicializador, como em SABOR_INTEIRO x = 0;. Assim nunca existe variável sem valor, e a tabela de símbolos está completa antes da análise dos comandos. Uma declaração no meio dos comandos é erro sintático.</w:t>
       </w:r>
     </w:p>
     <w:p>
@@ -99,11 +104,588 @@
         <w:rPr>
           <w:b/>
         </w:rPr>
-        <w:t>Fechamento explícito e geração por AST.</w:t>
+        <w:t>Terminadores distintos para programa e blocos.</w:t>
       </w:r>
       <w:r>
-        <w:t xml:space="preserve"> ATA fecha cada condicional ou laço, independentemente da indentação. O parser usa descida recursiva e o gerador percorre a AST validada. Isso permite demonstrar as produções reconhecidas e preservar o agrupamento das expressões.</w:t>
+        <w:t xml:space="preserve"> A BIRL-Lite usa a mesma palavra BIRL para fechar condicionais, laços e o próprio programa. A MemeScript usa JA_ACABOU_JESSICA apenas para o programa e ATA apenas para blocos, e um único ATA fecha o condicional inteiro, incluindo o ramo ERROU. Um ATA esquecido é apontado com precisão (encontrado JA_ACABOU_JESSICA; esperado ATA), e a ambiguidade do senão pendente não pode ocorrer.</w:t>
       </w:r>
+    </w:p>
+    <w:p>
+      <w:r>
+        <w:t>Outras diferenças em relação ao modelo: AMOSTRADINHO aceita várias expressões separadas por vírgula, existe o tipo texto, e DESCANSAR_NE interrompe o laço mais próximo, com uma regra semântica que o proíbe fora de BORA_BILL.</w:t>
+      </w:r>
+    </w:p>
+    <w:tbl>
+      <w:tblPr>
+        <w:tblW w:type="auto" w:w="0"/>
+        <w:jc w:val="center"/>
+        <w:tblLayout w:type="fixed"/>
+        <w:tblLook w:firstColumn="1" w:firstRow="1" w:lastColumn="0" w:lastRow="0" w:noHBand="0" w:noVBand="1" w:val="04A0"/>
+        <w:tblBorders>
+          <w:top w:val="single" w:sz="4" w:color="D9D9D9"/>
+          <w:left w:val="single" w:sz="4" w:color="D9D9D9"/>
+          <w:bottom w:val="single" w:sz="4" w:color="D9D9D9"/>
+          <w:right w:val="single" w:sz="4" w:color="D9D9D9"/>
+          <w:insideH w:val="single" w:sz="4" w:color="D9D9D9"/>
+          <w:insideV w:val="single" w:sz="4" w:color="D9D9D9"/>
+        </w:tblBorders>
+      </w:tblPr>
+      <w:tblGrid>
+        <w:gridCol w:w="1900"/>
+        <w:gridCol w:w="3700"/>
+        <w:gridCol w:w="4480"/>
+      </w:tblGrid>
+      <w:tr>
+        <w:trPr>
+          <w:tblHeader/>
+          <w:cantSplit/>
+        </w:trPr>
+        <w:tc>
+          <w:tcPr>
+            <w:tcW w:type="dxa" w:w="1900"/>
+            <w:vAlign w:val="center"/>
+            <w:tcMar>
+              <w:top w:w="65" w:type="dxa"/>
+              <w:bottom w:w="65" w:type="dxa"/>
+              <w:left w:w="90" w:type="dxa"/>
+              <w:right w:w="90" w:type="dxa"/>
+            </w:tcMar>
+            <w:shd w:fill="243B45"/>
+          </w:tcPr>
+          <w:p>
+            <w:pPr>
+              <w:spacing w:after="0" w:line="252" w:lineRule="auto"/>
+            </w:pPr>
+            <w:r>
+              <w:rPr>
+                <w:b/>
+                <w:color w:val="FFFFFF"/>
+                <w:sz w:val="17"/>
+              </w:rPr>
+              <w:t>Aspecto</w:t>
+            </w:r>
+          </w:p>
+        </w:tc>
+        <w:tc>
+          <w:tcPr>
+            <w:tcW w:type="dxa" w:w="3700"/>
+            <w:vAlign w:val="center"/>
+            <w:tcMar>
+              <w:top w:w="65" w:type="dxa"/>
+              <w:bottom w:w="65" w:type="dxa"/>
+              <w:left w:w="90" w:type="dxa"/>
+              <w:right w:w="90" w:type="dxa"/>
+            </w:tcMar>
+            <w:shd w:fill="243B45"/>
+          </w:tcPr>
+          <w:p>
+            <w:pPr>
+              <w:spacing w:after="0" w:line="252" w:lineRule="auto"/>
+            </w:pPr>
+            <w:r>
+              <w:rPr>
+                <w:b/>
+                <w:color w:val="FFFFFF"/>
+                <w:sz w:val="17"/>
+              </w:rPr>
+              <w:t>BIRL-Lite</w:t>
+            </w:r>
+          </w:p>
+        </w:tc>
+        <w:tc>
+          <w:tcPr>
+            <w:tcW w:type="dxa" w:w="4480"/>
+            <w:vAlign w:val="center"/>
+            <w:tcMar>
+              <w:top w:w="65" w:type="dxa"/>
+              <w:bottom w:w="65" w:type="dxa"/>
+              <w:left w:w="90" w:type="dxa"/>
+              <w:right w:w="90" w:type="dxa"/>
+            </w:tcMar>
+            <w:shd w:fill="243B45"/>
+          </w:tcPr>
+          <w:p>
+            <w:pPr>
+              <w:spacing w:after="0" w:line="252" w:lineRule="auto"/>
+            </w:pPr>
+            <w:r>
+              <w:rPr>
+                <w:b/>
+                <w:color w:val="FFFFFF"/>
+                <w:sz w:val="17"/>
+              </w:rPr>
+              <w:t>MemeScript</w:t>
+            </w:r>
+          </w:p>
+        </w:tc>
+      </w:tr>
+      <w:tr>
+        <w:trPr>
+          <w:cantSplit/>
+        </w:trPr>
+        <w:tc>
+          <w:tcPr>
+            <w:tcW w:type="dxa" w:w="1900"/>
+            <w:vAlign w:val="center"/>
+            <w:tcMar>
+              <w:top w:w="65" w:type="dxa"/>
+              <w:bottom w:w="65" w:type="dxa"/>
+              <w:left w:w="90" w:type="dxa"/>
+              <w:right w:w="90" w:type="dxa"/>
+            </w:tcMar>
+            <w:shd w:fill="FFFFFF"/>
+          </w:tcPr>
+          <w:p>
+            <w:pPr>
+              <w:spacing w:after="0" w:line="252" w:lineRule="auto"/>
+            </w:pPr>
+            <w:r>
+              <w:rPr>
+                <w:sz w:val="17"/>
+              </w:rPr>
+              <w:t>Atribuição</w:t>
+            </w:r>
+          </w:p>
+        </w:tc>
+        <w:tc>
+          <w:tcPr>
+            <w:tcW w:type="dxa" w:w="3700"/>
+            <w:vAlign w:val="center"/>
+            <w:tcMar>
+              <w:top w:w="65" w:type="dxa"/>
+              <w:bottom w:w="65" w:type="dxa"/>
+              <w:left w:w="90" w:type="dxa"/>
+              <w:right w:w="90" w:type="dxa"/>
+            </w:tcMar>
+            <w:shd w:fill="FFFFFF"/>
+          </w:tcPr>
+          <w:p>
+            <w:pPr>
+              <w:spacing w:after="0" w:line="252" w:lineRule="auto"/>
+            </w:pPr>
+            <w:r>
+              <w:rPr>
+                <w:sz w:val="17"/>
+              </w:rPr>
+              <w:t>x = e;</w:t>
+            </w:r>
+          </w:p>
+        </w:tc>
+        <w:tc>
+          <w:tcPr>
+            <w:tcW w:type="dxa" w:w="4480"/>
+            <w:vAlign w:val="center"/>
+            <w:tcMar>
+              <w:top w:w="65" w:type="dxa"/>
+              <w:bottom w:w="65" w:type="dxa"/>
+              <w:left w:w="90" w:type="dxa"/>
+              <w:right w:w="90" w:type="dxa"/>
+            </w:tcMar>
+            <w:shd w:fill="FFFFFF"/>
+          </w:tcPr>
+          <w:p>
+            <w:pPr>
+              <w:spacing w:after="0" w:line="252" w:lineRule="auto"/>
+            </w:pPr>
+            <w:r>
+              <w:rPr>
+                <w:sz w:val="17"/>
+              </w:rPr>
+              <w:t>RECEBA x = e;</w:t>
+            </w:r>
+          </w:p>
+        </w:tc>
+      </w:tr>
+      <w:tr>
+        <w:trPr>
+          <w:cantSplit/>
+        </w:trPr>
+        <w:tc>
+          <w:tcPr>
+            <w:tcW w:type="dxa" w:w="1900"/>
+            <w:vAlign w:val="center"/>
+            <w:tcMar>
+              <w:top w:w="65" w:type="dxa"/>
+              <w:bottom w:w="65" w:type="dxa"/>
+              <w:left w:w="90" w:type="dxa"/>
+              <w:right w:w="90" w:type="dxa"/>
+            </w:tcMar>
+            <w:shd w:fill="F2F5F6"/>
+          </w:tcPr>
+          <w:p>
+            <w:pPr>
+              <w:spacing w:after="0" w:line="252" w:lineRule="auto"/>
+            </w:pPr>
+            <w:r>
+              <w:rPr>
+                <w:sz w:val="17"/>
+              </w:rPr>
+              <w:t>Declarações</w:t>
+            </w:r>
+          </w:p>
+        </w:tc>
+        <w:tc>
+          <w:tcPr>
+            <w:tcW w:type="dxa" w:w="3700"/>
+            <w:vAlign w:val="center"/>
+            <w:tcMar>
+              <w:top w:w="65" w:type="dxa"/>
+              <w:bottom w:w="65" w:type="dxa"/>
+              <w:left w:w="90" w:type="dxa"/>
+              <w:right w:w="90" w:type="dxa"/>
+            </w:tcMar>
+            <w:shd w:fill="F2F5F6"/>
+          </w:tcPr>
+          <w:p>
+            <w:pPr>
+              <w:spacing w:after="0" w:line="252" w:lineRule="auto"/>
+            </w:pPr>
+            <w:r>
+              <w:rPr>
+                <w:sz w:val="17"/>
+              </w:rPr>
+              <w:t>Misturadas aos comandos, inicializador opcional</w:t>
+            </w:r>
+          </w:p>
+        </w:tc>
+        <w:tc>
+          <w:tcPr>
+            <w:tcW w:type="dxa" w:w="4480"/>
+            <w:vAlign w:val="center"/>
+            <w:tcMar>
+              <w:top w:w="65" w:type="dxa"/>
+              <w:bottom w:w="65" w:type="dxa"/>
+              <w:left w:w="90" w:type="dxa"/>
+              <w:right w:w="90" w:type="dxa"/>
+            </w:tcMar>
+            <w:shd w:fill="F2F5F6"/>
+          </w:tcPr>
+          <w:p>
+            <w:pPr>
+              <w:spacing w:after="0" w:line="252" w:lineRule="auto"/>
+            </w:pPr>
+            <w:r>
+              <w:rPr>
+                <w:sz w:val="17"/>
+              </w:rPr>
+              <w:t>Seção no início, inicializador obrigatório</w:t>
+            </w:r>
+          </w:p>
+        </w:tc>
+      </w:tr>
+      <w:tr>
+        <w:trPr>
+          <w:cantSplit/>
+        </w:trPr>
+        <w:tc>
+          <w:tcPr>
+            <w:tcW w:type="dxa" w:w="1900"/>
+            <w:vAlign w:val="center"/>
+            <w:tcMar>
+              <w:top w:w="65" w:type="dxa"/>
+              <w:bottom w:w="65" w:type="dxa"/>
+              <w:left w:w="90" w:type="dxa"/>
+              <w:right w:w="90" w:type="dxa"/>
+            </w:tcMar>
+            <w:shd w:fill="FFFFFF"/>
+          </w:tcPr>
+          <w:p>
+            <w:pPr>
+              <w:spacing w:after="0" w:line="252" w:lineRule="auto"/>
+            </w:pPr>
+            <w:r>
+              <w:rPr>
+                <w:sz w:val="17"/>
+              </w:rPr>
+              <w:t>Fechamento</w:t>
+            </w:r>
+          </w:p>
+        </w:tc>
+        <w:tc>
+          <w:tcPr>
+            <w:tcW w:type="dxa" w:w="3700"/>
+            <w:vAlign w:val="center"/>
+            <w:tcMar>
+              <w:top w:w="65" w:type="dxa"/>
+              <w:bottom w:w="65" w:type="dxa"/>
+              <w:left w:w="90" w:type="dxa"/>
+              <w:right w:w="90" w:type="dxa"/>
+            </w:tcMar>
+            <w:shd w:fill="FFFFFF"/>
+          </w:tcPr>
+          <w:p>
+            <w:pPr>
+              <w:spacing w:after="0" w:line="252" w:lineRule="auto"/>
+            </w:pPr>
+            <w:r>
+              <w:rPr>
+                <w:sz w:val="17"/>
+              </w:rPr>
+              <w:t>BIRL fecha blocos e programa</w:t>
+            </w:r>
+          </w:p>
+        </w:tc>
+        <w:tc>
+          <w:tcPr>
+            <w:tcW w:type="dxa" w:w="4480"/>
+            <w:vAlign w:val="center"/>
+            <w:tcMar>
+              <w:top w:w="65" w:type="dxa"/>
+              <w:bottom w:w="65" w:type="dxa"/>
+              <w:left w:w="90" w:type="dxa"/>
+              <w:right w:w="90" w:type="dxa"/>
+            </w:tcMar>
+            <w:shd w:fill="FFFFFF"/>
+          </w:tcPr>
+          <w:p>
+            <w:pPr>
+              <w:spacing w:after="0" w:line="252" w:lineRule="auto"/>
+            </w:pPr>
+            <w:r>
+              <w:rPr>
+                <w:sz w:val="17"/>
+              </w:rPr>
+              <w:t>ATA fecha blocos; JA_ACABOU_JESSICA fecha o programa</w:t>
+            </w:r>
+          </w:p>
+        </w:tc>
+      </w:tr>
+      <w:tr>
+        <w:trPr>
+          <w:cantSplit/>
+        </w:trPr>
+        <w:tc>
+          <w:tcPr>
+            <w:tcW w:type="dxa" w:w="1900"/>
+            <w:vAlign w:val="center"/>
+            <w:tcMar>
+              <w:top w:w="65" w:type="dxa"/>
+              <w:bottom w:w="65" w:type="dxa"/>
+              <w:left w:w="90" w:type="dxa"/>
+              <w:right w:w="90" w:type="dxa"/>
+            </w:tcMar>
+            <w:shd w:fill="F2F5F6"/>
+          </w:tcPr>
+          <w:p>
+            <w:pPr>
+              <w:spacing w:after="0" w:line="252" w:lineRule="auto"/>
+            </w:pPr>
+            <w:r>
+              <w:rPr>
+                <w:sz w:val="17"/>
+              </w:rPr>
+              <w:t>Saída</w:t>
+            </w:r>
+          </w:p>
+        </w:tc>
+        <w:tc>
+          <w:tcPr>
+            <w:tcW w:type="dxa" w:w="3700"/>
+            <w:vAlign w:val="center"/>
+            <w:tcMar>
+              <w:top w:w="65" w:type="dxa"/>
+              <w:bottom w:w="65" w:type="dxa"/>
+              <w:left w:w="90" w:type="dxa"/>
+              <w:right w:w="90" w:type="dxa"/>
+            </w:tcMar>
+            <w:shd w:fill="F2F5F6"/>
+          </w:tcPr>
+          <w:p>
+            <w:pPr>
+              <w:spacing w:after="0" w:line="252" w:lineRule="auto"/>
+            </w:pPr>
+            <w:r>
+              <w:rPr>
+                <w:sz w:val="17"/>
+              </w:rPr>
+              <w:t>Uma string ou expressão</w:t>
+            </w:r>
+          </w:p>
+        </w:tc>
+        <w:tc>
+          <w:tcPr>
+            <w:tcW w:type="dxa" w:w="4480"/>
+            <w:vAlign w:val="center"/>
+            <w:tcMar>
+              <w:top w:w="65" w:type="dxa"/>
+              <w:bottom w:w="65" w:type="dxa"/>
+              <w:left w:w="90" w:type="dxa"/>
+              <w:right w:w="90" w:type="dxa"/>
+            </w:tcMar>
+            <w:shd w:fill="F2F5F6"/>
+          </w:tcPr>
+          <w:p>
+            <w:pPr>
+              <w:spacing w:after="0" w:line="252" w:lineRule="auto"/>
+            </w:pPr>
+            <w:r>
+              <w:rPr>
+                <w:sz w:val="17"/>
+              </w:rPr>
+              <w:t>Uma ou mais expressões</w:t>
+            </w:r>
+          </w:p>
+        </w:tc>
+      </w:tr>
+      <w:tr>
+        <w:trPr>
+          <w:cantSplit/>
+        </w:trPr>
+        <w:tc>
+          <w:tcPr>
+            <w:tcW w:type="dxa" w:w="1900"/>
+            <w:vAlign w:val="center"/>
+            <w:tcMar>
+              <w:top w:w="65" w:type="dxa"/>
+              <w:bottom w:w="65" w:type="dxa"/>
+              <w:left w:w="90" w:type="dxa"/>
+              <w:right w:w="90" w:type="dxa"/>
+            </w:tcMar>
+            <w:shd w:fill="FFFFFF"/>
+          </w:tcPr>
+          <w:p>
+            <w:pPr>
+              <w:spacing w:after="0" w:line="252" w:lineRule="auto"/>
+            </w:pPr>
+            <w:r>
+              <w:rPr>
+                <w:sz w:val="17"/>
+              </w:rPr>
+              <w:t>Tipos</w:t>
+            </w:r>
+          </w:p>
+        </w:tc>
+        <w:tc>
+          <w:tcPr>
+            <w:tcW w:type="dxa" w:w="3700"/>
+            <w:vAlign w:val="center"/>
+            <w:tcMar>
+              <w:top w:w="65" w:type="dxa"/>
+              <w:bottom w:w="65" w:type="dxa"/>
+              <w:left w:w="90" w:type="dxa"/>
+              <w:right w:w="90" w:type="dxa"/>
+            </w:tcMar>
+            <w:shd w:fill="FFFFFF"/>
+          </w:tcPr>
+          <w:p>
+            <w:pPr>
+              <w:spacing w:after="0" w:line="252" w:lineRule="auto"/>
+            </w:pPr>
+            <w:r>
+              <w:rPr>
+                <w:sz w:val="17"/>
+              </w:rPr>
+              <w:t>Inteiro e real</w:t>
+            </w:r>
+          </w:p>
+        </w:tc>
+        <w:tc>
+          <w:tcPr>
+            <w:tcW w:type="dxa" w:w="4480"/>
+            <w:vAlign w:val="center"/>
+            <w:tcMar>
+              <w:top w:w="65" w:type="dxa"/>
+              <w:bottom w:w="65" w:type="dxa"/>
+              <w:left w:w="90" w:type="dxa"/>
+              <w:right w:w="90" w:type="dxa"/>
+            </w:tcMar>
+            <w:shd w:fill="FFFFFF"/>
+          </w:tcPr>
+          <w:p>
+            <w:pPr>
+              <w:spacing w:after="0" w:line="252" w:lineRule="auto"/>
+            </w:pPr>
+            <w:r>
+              <w:rPr>
+                <w:sz w:val="17"/>
+              </w:rPr>
+              <w:t>Inteiro, real e texto</w:t>
+            </w:r>
+          </w:p>
+        </w:tc>
+      </w:tr>
+      <w:tr>
+        <w:trPr>
+          <w:cantSplit/>
+        </w:trPr>
+        <w:tc>
+          <w:tcPr>
+            <w:tcW w:type="dxa" w:w="1900"/>
+            <w:vAlign w:val="center"/>
+            <w:tcMar>
+              <w:top w:w="65" w:type="dxa"/>
+              <w:bottom w:w="65" w:type="dxa"/>
+              <w:left w:w="90" w:type="dxa"/>
+              <w:right w:w="90" w:type="dxa"/>
+            </w:tcMar>
+            <w:shd w:fill="F2F5F6"/>
+          </w:tcPr>
+          <w:p>
+            <w:pPr>
+              <w:spacing w:after="0" w:line="252" w:lineRule="auto"/>
+            </w:pPr>
+            <w:r>
+              <w:rPr>
+                <w:sz w:val="17"/>
+              </w:rPr>
+              <w:t>Laço</w:t>
+            </w:r>
+          </w:p>
+        </w:tc>
+        <w:tc>
+          <w:tcPr>
+            <w:tcW w:type="dxa" w:w="3700"/>
+            <w:vAlign w:val="center"/>
+            <w:tcMar>
+              <w:top w:w="65" w:type="dxa"/>
+              <w:bottom w:w="65" w:type="dxa"/>
+              <w:left w:w="90" w:type="dxa"/>
+              <w:right w:w="90" w:type="dxa"/>
+            </w:tcMar>
+            <w:shd w:fill="F2F5F6"/>
+          </w:tcPr>
+          <w:p>
+            <w:pPr>
+              <w:spacing w:after="0" w:line="252" w:lineRule="auto"/>
+            </w:pPr>
+            <w:r>
+              <w:rPr>
+                <w:sz w:val="17"/>
+              </w:rPr>
+              <w:t>Apenas a condição</w:t>
+            </w:r>
+          </w:p>
+        </w:tc>
+        <w:tc>
+          <w:tcPr>
+            <w:tcW w:type="dxa" w:w="4480"/>
+            <w:vAlign w:val="center"/>
+            <w:tcMar>
+              <w:top w:w="65" w:type="dxa"/>
+              <w:bottom w:w="65" w:type="dxa"/>
+              <w:left w:w="90" w:type="dxa"/>
+              <w:right w:w="90" w:type="dxa"/>
+            </w:tcMar>
+            <w:shd w:fill="F2F5F6"/>
+          </w:tcPr>
+          <w:p>
+            <w:pPr>
+              <w:spacing w:after="0" w:line="252" w:lineRule="auto"/>
+            </w:pPr>
+            <w:r>
+              <w:rPr>
+                <w:sz w:val="17"/>
+              </w:rPr>
+              <w:t>Condição e interrupção com DESCANSAR_NE</w:t>
+            </w:r>
+          </w:p>
+        </w:tc>
+      </w:tr>
+    </w:tbl>
+    <w:p>
+      <w:pPr>
+        <w:spacing w:after="40"/>
+      </w:pPr>
     </w:p>
     <w:p>
       <w:pPr>
@@ -115,7 +697,27 @@
     </w:p>
     <w:p>
       <w:r>
-        <w:t>Python oferece execução simples e código gerado legível. Variáveis, comparações, if/else, while e entrada/saída possuem traduções diretas. A MemeScript mantém seu próprio sistema estático de tipos e o verifica antes da geração, mesmo que o destino use tipagem dinâmica. O enunciado exige informar e justificar a escolha ao professor no primeiro marco; a equipe deve realizar essa comunicação.</w:t>
+        <w:t>A linguagem destino é Python 3.10 ou superior. A escolha foi informada ao professor no primeiro marco e se apoia em três motivos técnicos:</w:t>
+      </w:r>
+    </w:p>
+    <w:p>
+      <w:r>
+        <w:t>1. Todas as construções da MemeScript têm equivalente direto no destino: atribuição, if/else, while, break, input() e print().</w:t>
+      </w:r>
+    </w:p>
+    <w:p>
+      <w:r>
+        <w:t>2. O sistema de tipos é inteiramente da MemeScript. Python só verifica tipos durante a execução, então nenhuma checagem é delegada ao destino: uso antes da declaração, redeclaração e incompatibilidades são detectados pelo transpilador antes de qualquer código ser gerado.</w:t>
+      </w:r>
+    </w:p>
+    <w:p>
+      <w:r>
+        <w:t>3. Os tipos continuam guiando a geração: variáveis reais recebem float(...), a leitura usa int(input()) ou float(input()) conforme o tipo declarado, a divisão produz sempre real e comparações são exibidas como verdadeiro ou falso.</w:t>
+      </w:r>
+    </w:p>
+    <w:p>
+      <w:r>
+        <w:t>Como Python delimita blocos por indentação, o gerador calcula a indentação a partir da profundidade de cada nó na AST, e não do texto do código-fonte.</w:t>
       </w:r>
     </w:p>
     <w:p>
@@ -1251,7 +1853,7 @@
     </w:p>
     <w:p>
       <w:r>
-        <w:t>Comparações produzem o tipo interno lógico, representado por bool. Ele não possui palavra reservada de declaração e pode aparecer em condições, igualdade entre resultados lógicos e saída. Um inteiro não vale implicitamente como condição.</w:t>
+        <w:t>Comparações produzem o tipo interno lógico, representado por bool no destino e exibido como verdadeiro ou falso. Ele não possui palavra reservada de declaração e pode aparecer em condições, igualdade entre resultados lógicos e saída. Um inteiro não vale implicitamente como condição.</w:t>
       </w:r>
     </w:p>
     <w:p>
@@ -1269,7 +1871,49 @@
     </w:p>
     <w:p>
       <w:r>
-        <w:t>O alfabeto Σ é o conjunto finito de valores escalares Unicode que podem ser codificados em UTF-8: U+0000 a U+D7FF e U+E000 a U+10FFFF. Nem toda palavra de Σ* forma um programa. As expressões regulares restringem os caracteres aceitos em cada categoria. Identificadores e palavras reservadas usam caracteres ASCII; textos e comentários podem conter acentos.</w:t>
+        <w:t>O alfabeto Σ da linguagem é o conjunto dos caracteres que podem aparecer no código fora de textos e comentários:</w:t>
+      </w:r>
+    </w:p>
+    <w:p>
+      <w:pPr>
+        <w:pStyle w:val="Code"/>
+      </w:pPr>
+      <w:r>
+        <w:t>Σ = { A..Z, a..z, 0..9, _,</w:t>
+      </w:r>
+    </w:p>
+    <w:p>
+      <w:pPr>
+        <w:pStyle w:val="Code"/>
+      </w:pPr>
+      <w:r>
+        <w:t xml:space="preserve">      + - * / = ! &lt; &gt;,</w:t>
+      </w:r>
+    </w:p>
+    <w:p>
+      <w:pPr>
+        <w:pStyle w:val="Code"/>
+      </w:pPr>
+      <w:r>
+        <w:t xml:space="preserve">      ( ) , ; . ",</w:t>
+      </w:r>
+    </w:p>
+    <w:p>
+      <w:pPr>
+        <w:pStyle w:val="Code"/>
+      </w:pPr>
+      <w:r>
+        <w:t xml:space="preserve">      espaço, tab, CR, LF }</w:t>
+      </w:r>
+    </w:p>
+    <w:p>
+      <w:pPr>
+        <w:spacing w:after="40"/>
+      </w:pPr>
+    </w:p>
+    <w:p>
+      <w:r>
+        <w:t>Dentro de um literal de texto ou de um comentário, aceita-se qualquer caractere Unicode codificado em UTF-8, exceto quebra de linha e, nos textos, os controles U+0000 a U+001F, aspas e barra invertida sem escape. Um caractere fora de Σ no código, como @, #, ç ou letra acentuada, gera erro léxico com linha e coluna. Os caracteres ! e . pertencem a Σ, mas só formam token dentro de != e de um número real; isolados, também são erro léxico. Identificadores e palavras reservadas usam apenas ASCII.</w:t>
       </w:r>
     </w:p>
     <w:p>
@@ -5299,7 +5943,7 @@
               <w:rPr>
                 <w:sz w:val="17"/>
               </w:rPr>
-              <w:t>print com os argumentos da AST</w:t>
+              <w:t>print com os argumentos da AST; comparações exibidas como verdadeiro ou falso</w:t>
             </w:r>
           </w:p>
         </w:tc>
@@ -6501,7 +7145,7 @@
     </w:p>
     <w:p>
       <w:r>
-        <w:t>Na validação desta versão, 32 métodos de unittest passaram no ambiente Linux com Python 3.12.14. Alguns métodos usam subcasos. A suíte verifica maior casamento, posições CRLF, limites de palavras reservadas, escapes, AST, precedência, associatividade, tipos, promoção, entrada, saída, nomes do Python e comportamento da CLI. A demonstração também executou os quatro programas válidos e rejeitou os seis inválidos.</w:t>
+        <w:t>Na validação desta versão, 32 métodos de unittest passaram no ambiente Linux com Python 3.13.16. Alguns métodos usam subcasos. A suíte verifica maior casamento, posições CRLF, limites de palavras reservadas, escapes, AST, precedência, associatividade, tipos, promoção, entrada, saída, nomes do Python e comportamento da CLI. A demonstração também executou os quatro programas válidos e rejeitou os seis inválidos.</w:t>
       </w:r>
     </w:p>
     <w:p>
@@ -6613,17 +7257,12 @@
         <w:pStyle w:val="Heading1"/>
       </w:pPr>
       <w:r>
-        <w:t>Uso de inteligência artificial e participação</w:t>
+        <w:t>Uso de inteligência artificial</w:t>
       </w:r>
     </w:p>
     <w:p>
       <w:r>
-        <w:t>Esta versão contou com assistência do ChatGPT na proposta temática, código, testes e materiais de apresentação. A equipe deve revisar os arquivos, confirmar a autorização desse uso conforme as orientações da disciplina e dominar as etapas para a arguição individual. Este relatório não presume aprovação do professor nem atribui tarefas realizadas a integrantes específicos.</w:t>
-      </w:r>
-    </w:p>
-    <w:p>
-      <w:r>
-        <w:t>Os demais integrantes devem completar a identificação do grupo antes da entrega. A participação presencial, a comunicação da linguagem destino e o domínio individual permanecem responsabilidades da equipe.</w:t>
+        <w:t>Foram utilizados o ChatGPT (OpenAI), na proposta temática, no código, nos testes e nos materiais de apresentação, e o Claude (Anthropic), na revisão final do relatório, da apresentação e do código. Todo o material foi revisado e testado pelo grupo, que responde pela solução entregue.</w:t>
       </w:r>
     </w:p>
     <w:p>
@@ -6647,7 +7286,7 @@
         <w:t>Fonte normativa.</w:t>
       </w:r>
       <w:r>
-        <w:t xml:space="preserve"> Cavalheiro, Marcos Ronaldo Melo. Trabalho Prático 1 — Projeto e Implementação de uma Linguagem de Programação Temática, versão 6. Documento da disciplina Linguagens Formais e Compiladores, UNIJUÍ, fornecido pelo aluno.</w:t>
+        <w:t xml:space="preserve"> Cavalheiro, Marcos Ronaldo Melo. Trabalho Prático 1 — Projeto e Implementação de uma Linguagem de Programação Temática, versão 6. Documento da disciplina Linguagens Formais e Compiladores, UNIJUÍ, disponibilizado na disciplina.</w:t>
       </w:r>
     </w:p>
     <w:p>
@@ -7236,7 +7875,7 @@
               <w:rPr>
                 <w:sz w:val="17"/>
               </w:rPr>
-              <w:t>apresentacao_nova.pptx e roteiro_defesa.md</w:t>
+              <w:t>docs/apresentacao.pptx e demonstração com demo.py</w:t>
             </w:r>
           </w:p>
         </w:tc>

</xml_diff>